<commit_message>
Add case study on data representation and ethics in modeling people
This commit introduces a new case study titled "How We Represent People: ADTs and the Ethics of Data Modeling." The study explores the implications of schema design in data systems, particularly focusing on names and gender representation. It discusses historical incidents, technical implementations, and the ongoing debate between Universalist and Pluralist perspectives on data modeling. The case study includes examples, discussion questions, and further reading to encourage critical thinking on the topic.
</commit_message>
<xml_diff>
--- a/docs/v2/cases/index.docx
+++ b/docs/v2/cases/index.docx
@@ -31,7 +31,7 @@
         <w:pStyle w:val="Date"/>
       </w:pPr>
       <w:r>
-        <w:t xml:space="preserve">2026-05-22</w:t>
+        <w:t xml:space="preserve">2026-05-25</w:t>
       </w:r>
     </w:p>
     <w:p>
@@ -304,8 +304,52 @@
             <w:pPr>
               <w:pStyle w:val="Compact"/>
             </w:pPr>
-            <w:r>
-              <w:t xml:space="preserve">How We Represent People: ADTs and the Ethics of Data Modeling</w:t>
+            <w:hyperlink r:id="rId13">
+              <w:r>
+                <w:rPr>
+                  <w:rStyle w:val="Hyperlink"/>
+                </w:rPr>
+                <w:t xml:space="preserve">How We Represent People: ADTs and the Ethics of Data Modeling</w:t>
+              </w:r>
+            </w:hyperlink>
+          </w:p>
+        </w:tc>
+        <w:tc>
+          <w:tcPr/>
+          <w:p>
+            <w:pPr>
+              <w:pStyle w:val="Compact"/>
+            </w:pPr>
+            <w:r>
+              <w:rPr>
+                <w:b/>
+                <w:bCs/>
+              </w:rPr>
+              <w:t xml:space="preserve">Available</w:t>
+            </w:r>
+          </w:p>
+        </w:tc>
+      </w:tr>
+      <w:tr>
+        <w:tc>
+          <w:tcPr/>
+          <w:p>
+            <w:pPr>
+              <w:pStyle w:val="Compact"/>
+            </w:pPr>
+            <w:r>
+              <w:t xml:space="preserve">6</w:t>
+            </w:r>
+          </w:p>
+        </w:tc>
+        <w:tc>
+          <w:tcPr/>
+          <w:p>
+            <w:pPr>
+              <w:pStyle w:val="Compact"/>
+            </w:pPr>
+            <w:r>
+              <w:t xml:space="preserve">Was OOP a Mistake? Alan Kay, Smalltalk &amp; the Backlash</w:t>
             </w:r>
           </w:p>
         </w:tc>
@@ -333,18 +377,18 @@
               <w:pStyle w:val="Compact"/>
             </w:pPr>
             <w:r>
-              <w:t xml:space="preserve">6</w:t>
-            </w:r>
-          </w:p>
-        </w:tc>
-        <w:tc>
-          <w:tcPr/>
-          <w:p>
-            <w:pPr>
-              <w:pStyle w:val="Compact"/>
-            </w:pPr>
-            <w:r>
-              <w:t xml:space="preserve">Was OOP a Mistake? Alan Kay, Smalltalk &amp; the Backlash</w:t>
+              <w:t xml:space="preserve">7</w:t>
+            </w:r>
+          </w:p>
+        </w:tc>
+        <w:tc>
+          <w:tcPr/>
+          <w:p>
+            <w:pPr>
+              <w:pStyle w:val="Compact"/>
+            </w:pPr>
+            <w:r>
+              <w:t xml:space="preserve">The Halting Problem &amp; the Limits of Machines</w:t>
             </w:r>
           </w:p>
         </w:tc>
@@ -372,18 +416,18 @@
               <w:pStyle w:val="Compact"/>
             </w:pPr>
             <w:r>
-              <w:t xml:space="preserve">7</w:t>
-            </w:r>
-          </w:p>
-        </w:tc>
-        <w:tc>
-          <w:tcPr/>
-          <w:p>
-            <w:pPr>
-              <w:pStyle w:val="Compact"/>
-            </w:pPr>
-            <w:r>
-              <w:t xml:space="preserve">The Halting Problem &amp; the Limits of Machines</w:t>
+              <w:t xml:space="preserve">8</w:t>
+            </w:r>
+          </w:p>
+        </w:tc>
+        <w:tc>
+          <w:tcPr/>
+          <w:p>
+            <w:pPr>
+              <w:pStyle w:val="Compact"/>
+            </w:pPr>
+            <w:r>
+              <w:t xml:space="preserve">Open Source &amp; the Code an AI Learned From — Linux, Git &amp; Copilot</w:t>
             </w:r>
           </w:p>
         </w:tc>
@@ -411,18 +455,18 @@
               <w:pStyle w:val="Compact"/>
             </w:pPr>
             <w:r>
-              <w:t xml:space="preserve">8</w:t>
-            </w:r>
-          </w:p>
-        </w:tc>
-        <w:tc>
-          <w:tcPr/>
-          <w:p>
-            <w:pPr>
-              <w:pStyle w:val="Compact"/>
-            </w:pPr>
-            <w:r>
-              <w:t xml:space="preserve">Open Source &amp; the Code an AI Learned From — Linux, Git &amp; Copilot</w:t>
+              <w:t xml:space="preserve">9</w:t>
+            </w:r>
+          </w:p>
+        </w:tc>
+        <w:tc>
+          <w:tcPr/>
+          <w:p>
+            <w:pPr>
+              <w:pStyle w:val="Compact"/>
+            </w:pPr>
+            <w:r>
+              <w:t xml:space="preserve">From SQL to NoSQL — Why Google Built Bigtable</w:t>
             </w:r>
           </w:p>
         </w:tc>
@@ -450,18 +494,18 @@
               <w:pStyle w:val="Compact"/>
             </w:pPr>
             <w:r>
-              <w:t xml:space="preserve">9</w:t>
-            </w:r>
-          </w:p>
-        </w:tc>
-        <w:tc>
-          <w:tcPr/>
-          <w:p>
-            <w:pPr>
-              <w:pStyle w:val="Compact"/>
-            </w:pPr>
-            <w:r>
-              <w:t xml:space="preserve">From SQL to NoSQL — Why Google Built Bigtable</w:t>
+              <w:t xml:space="preserve">10</w:t>
+            </w:r>
+          </w:p>
+        </w:tc>
+        <w:tc>
+          <w:tcPr/>
+          <w:p>
+            <w:pPr>
+              <w:pStyle w:val="Compact"/>
+            </w:pPr>
+            <w:r>
+              <w:t xml:space="preserve">Three Companies Own the Internet — ARPANET to the Cloud Oligopoly</w:t>
             </w:r>
           </w:p>
         </w:tc>
@@ -489,18 +533,18 @@
               <w:pStyle w:val="Compact"/>
             </w:pPr>
             <w:r>
-              <w:t xml:space="preserve">10</w:t>
-            </w:r>
-          </w:p>
-        </w:tc>
-        <w:tc>
-          <w:tcPr/>
-          <w:p>
-            <w:pPr>
-              <w:pStyle w:val="Compact"/>
-            </w:pPr>
-            <w:r>
-              <w:t xml:space="preserve">Three Companies Own the Internet — ARPANET to the Cloud Oligopoly</w:t>
+              <w:t xml:space="preserve">11</w:t>
+            </w:r>
+          </w:p>
+        </w:tc>
+        <w:tc>
+          <w:tcPr/>
+          <w:p>
+            <w:pPr>
+              <w:pStyle w:val="Compact"/>
+            </w:pPr>
+            <w:r>
+              <w:t xml:space="preserve">The Equifax Breach</w:t>
             </w:r>
           </w:p>
         </w:tc>
@@ -528,18 +572,18 @@
               <w:pStyle w:val="Compact"/>
             </w:pPr>
             <w:r>
-              <w:t xml:space="preserve">11</w:t>
-            </w:r>
-          </w:p>
-        </w:tc>
-        <w:tc>
-          <w:tcPr/>
-          <w:p>
-            <w:pPr>
-              <w:pStyle w:val="Compact"/>
-            </w:pPr>
-            <w:r>
-              <w:t xml:space="preserve">The Equifax Breach</w:t>
+              <w:t xml:space="preserve">12</w:t>
+            </w:r>
+          </w:p>
+        </w:tc>
+        <w:tc>
+          <w:tcPr/>
+          <w:p>
+            <w:pPr>
+              <w:pStyle w:val="Compact"/>
+            </w:pPr>
+            <w:r>
+              <w:t xml:space="preserve">COMPAS, Facial Recognition &amp; AI Accountability</w:t>
             </w:r>
           </w:p>
         </w:tc>
@@ -559,47 +603,8 @@
           </w:p>
         </w:tc>
       </w:tr>
-      <w:tr>
-        <w:tc>
-          <w:tcPr/>
-          <w:p>
-            <w:pPr>
-              <w:pStyle w:val="Compact"/>
-            </w:pPr>
-            <w:r>
-              <w:t xml:space="preserve">12</w:t>
-            </w:r>
-          </w:p>
-        </w:tc>
-        <w:tc>
-          <w:tcPr/>
-          <w:p>
-            <w:pPr>
-              <w:pStyle w:val="Compact"/>
-            </w:pPr>
-            <w:r>
-              <w:t xml:space="preserve">COMPAS, Facial Recognition &amp; AI Accountability</w:t>
-            </w:r>
-          </w:p>
-        </w:tc>
-        <w:tc>
-          <w:tcPr/>
-          <w:p>
-            <w:pPr>
-              <w:pStyle w:val="Compact"/>
-            </w:pPr>
-            <w:r>
-              <w:rPr>
-                <w:i/>
-                <w:iCs/>
-              </w:rPr>
-              <w:t xml:space="preserve">In progress</w:t>
-            </w:r>
-          </w:p>
-        </w:tc>
-      </w:tr>
     </w:tbl>
-    <w:bookmarkStart w:id="13" w:name="how-to-read-these"/>
+    <w:bookmarkStart w:id="14" w:name="how-to-read-these"/>
     <w:p>
       <w:pPr>
         <w:pStyle w:val="Heading2"/>
@@ -730,7 +735,7 @@
         <w:t xml:space="preserve">about with other people — not for looking up.</w:t>
       </w:r>
     </w:p>
-    <w:bookmarkEnd w:id="13"/>
+    <w:bookmarkEnd w:id="14"/>
     <w:sectPr>
       <w:footnotePr>
         <w:numRestart w:val="eachSect"/>

</xml_diff>

<commit_message>
Refactor markdown cells in COMP1150_NB06_ModulesOOP.ipynb for improved readability; add new QuizReference_OutcomesAndTerms.md for chapter learning outcomes and key terms.
</commit_message>
<xml_diff>
--- a/docs/v2/cases/index.docx
+++ b/docs/v2/cases/index.docx
@@ -31,7 +31,7 @@
         <w:pStyle w:val="Date"/>
       </w:pPr>
       <w:r>
-        <w:t xml:space="preserve">2026-06-02</w:t>
+        <w:t xml:space="preserve">2026-06-10</w:t>
       </w:r>
     </w:p>
     <w:p>
@@ -406,8 +406,58 @@
             <w:pPr>
               <w:pStyle w:val="Compact"/>
             </w:pPr>
-            <w:r>
-              <w:t xml:space="preserve">The Halting Problem &amp; the Limits of Machines</w:t>
+            <w:hyperlink r:id="rId15">
+              <w:r>
+                <w:rPr>
+                  <w:rStyle w:val="Hyperlink"/>
+                </w:rPr>
+                <w:t xml:space="preserve">“We Must Know — We Will Know”</w:t>
+              </w:r>
+              <w:r>
+                <w:rPr>
+                  <w:rStyle w:val="Hyperlink"/>
+                </w:rPr>
+                <w:t xml:space="preserve">: Gödel, Turing, and the Problem No Computer Can Solve</w:t>
+              </w:r>
+            </w:hyperlink>
+          </w:p>
+        </w:tc>
+        <w:tc>
+          <w:tcPr/>
+          <w:p>
+            <w:pPr>
+              <w:pStyle w:val="Compact"/>
+            </w:pPr>
+            <w:r>
+              <w:rPr>
+                <w:b/>
+                <w:bCs/>
+              </w:rPr>
+              <w:t xml:space="preserve">Available</w:t>
+            </w:r>
+          </w:p>
+        </w:tc>
+      </w:tr>
+      <w:tr>
+        <w:tc>
+          <w:tcPr/>
+          <w:p>
+            <w:pPr>
+              <w:pStyle w:val="Compact"/>
+            </w:pPr>
+            <w:r>
+              <w:t xml:space="preserve">8</w:t>
+            </w:r>
+          </w:p>
+        </w:tc>
+        <w:tc>
+          <w:tcPr/>
+          <w:p>
+            <w:pPr>
+              <w:pStyle w:val="Compact"/>
+            </w:pPr>
+            <w:r>
+              <w:t xml:space="preserve">Open Source &amp; the Code an AI Learned From — Linux, Git &amp; Copilot</w:t>
             </w:r>
           </w:p>
         </w:tc>
@@ -435,18 +485,18 @@
               <w:pStyle w:val="Compact"/>
             </w:pPr>
             <w:r>
-              <w:t xml:space="preserve">8</w:t>
-            </w:r>
-          </w:p>
-        </w:tc>
-        <w:tc>
-          <w:tcPr/>
-          <w:p>
-            <w:pPr>
-              <w:pStyle w:val="Compact"/>
-            </w:pPr>
-            <w:r>
-              <w:t xml:space="preserve">Open Source &amp; the Code an AI Learned From — Linux, Git &amp; Copilot</w:t>
+              <w:t xml:space="preserve">9</w:t>
+            </w:r>
+          </w:p>
+        </w:tc>
+        <w:tc>
+          <w:tcPr/>
+          <w:p>
+            <w:pPr>
+              <w:pStyle w:val="Compact"/>
+            </w:pPr>
+            <w:r>
+              <w:t xml:space="preserve">From SQL to NoSQL — Why Google Built Bigtable</w:t>
             </w:r>
           </w:p>
         </w:tc>
@@ -474,18 +524,18 @@
               <w:pStyle w:val="Compact"/>
             </w:pPr>
             <w:r>
-              <w:t xml:space="preserve">9</w:t>
-            </w:r>
-          </w:p>
-        </w:tc>
-        <w:tc>
-          <w:tcPr/>
-          <w:p>
-            <w:pPr>
-              <w:pStyle w:val="Compact"/>
-            </w:pPr>
-            <w:r>
-              <w:t xml:space="preserve">From SQL to NoSQL — Why Google Built Bigtable</w:t>
+              <w:t xml:space="preserve">10</w:t>
+            </w:r>
+          </w:p>
+        </w:tc>
+        <w:tc>
+          <w:tcPr/>
+          <w:p>
+            <w:pPr>
+              <w:pStyle w:val="Compact"/>
+            </w:pPr>
+            <w:r>
+              <w:t xml:space="preserve">Three Companies Own the Internet — ARPANET to the Cloud Oligopoly</w:t>
             </w:r>
           </w:p>
         </w:tc>
@@ -513,18 +563,18 @@
               <w:pStyle w:val="Compact"/>
             </w:pPr>
             <w:r>
-              <w:t xml:space="preserve">10</w:t>
-            </w:r>
-          </w:p>
-        </w:tc>
-        <w:tc>
-          <w:tcPr/>
-          <w:p>
-            <w:pPr>
-              <w:pStyle w:val="Compact"/>
-            </w:pPr>
-            <w:r>
-              <w:t xml:space="preserve">Three Companies Own the Internet — ARPANET to the Cloud Oligopoly</w:t>
+              <w:t xml:space="preserve">11</w:t>
+            </w:r>
+          </w:p>
+        </w:tc>
+        <w:tc>
+          <w:tcPr/>
+          <w:p>
+            <w:pPr>
+              <w:pStyle w:val="Compact"/>
+            </w:pPr>
+            <w:r>
+              <w:t xml:space="preserve">The Equifax Breach</w:t>
             </w:r>
           </w:p>
         </w:tc>
@@ -552,18 +602,18 @@
               <w:pStyle w:val="Compact"/>
             </w:pPr>
             <w:r>
-              <w:t xml:space="preserve">11</w:t>
-            </w:r>
-          </w:p>
-        </w:tc>
-        <w:tc>
-          <w:tcPr/>
-          <w:p>
-            <w:pPr>
-              <w:pStyle w:val="Compact"/>
-            </w:pPr>
-            <w:r>
-              <w:t xml:space="preserve">The Equifax Breach</w:t>
+              <w:t xml:space="preserve">12</w:t>
+            </w:r>
+          </w:p>
+        </w:tc>
+        <w:tc>
+          <w:tcPr/>
+          <w:p>
+            <w:pPr>
+              <w:pStyle w:val="Compact"/>
+            </w:pPr>
+            <w:r>
+              <w:t xml:space="preserve">COMPAS, Facial Recognition &amp; AI Accountability</w:t>
             </w:r>
           </w:p>
         </w:tc>
@@ -583,47 +633,8 @@
           </w:p>
         </w:tc>
       </w:tr>
-      <w:tr>
-        <w:tc>
-          <w:tcPr/>
-          <w:p>
-            <w:pPr>
-              <w:pStyle w:val="Compact"/>
-            </w:pPr>
-            <w:r>
-              <w:t xml:space="preserve">12</w:t>
-            </w:r>
-          </w:p>
-        </w:tc>
-        <w:tc>
-          <w:tcPr/>
-          <w:p>
-            <w:pPr>
-              <w:pStyle w:val="Compact"/>
-            </w:pPr>
-            <w:r>
-              <w:t xml:space="preserve">COMPAS, Facial Recognition &amp; AI Accountability</w:t>
-            </w:r>
-          </w:p>
-        </w:tc>
-        <w:tc>
-          <w:tcPr/>
-          <w:p>
-            <w:pPr>
-              <w:pStyle w:val="Compact"/>
-            </w:pPr>
-            <w:r>
-              <w:rPr>
-                <w:i/>
-                <w:iCs/>
-              </w:rPr>
-              <w:t xml:space="preserve">In progress</w:t>
-            </w:r>
-          </w:p>
-        </w:tc>
-      </w:tr>
     </w:tbl>
-    <w:bookmarkStart w:id="15" w:name="how-to-read-these"/>
+    <w:bookmarkStart w:id="16" w:name="how-to-read-these"/>
     <w:p>
       <w:pPr>
         <w:pStyle w:val="Heading2"/>
@@ -754,7 +765,7 @@
         <w:t xml:space="preserve">looking up.</w:t>
       </w:r>
     </w:p>
-    <w:bookmarkEnd w:id="15"/>
+    <w:bookmarkEnd w:id="16"/>
     <w:sectPr>
       <w:footnotePr>
         <w:numRestart w:val="eachSect"/>

</xml_diff>

<commit_message>
Add Case Study 8: Open Source & the Code an AI Learned From (Linux, Git & Copilot)
Co-Authored-By: Claude Fable 5 <noreply@anthropic.com>
</commit_message>
<xml_diff>
--- a/docs/v2/cases/index.docx
+++ b/docs/v2/cases/index.docx
@@ -31,7 +31,7 @@
         <w:pStyle w:val="Date"/>
       </w:pPr>
       <w:r>
-        <w:t xml:space="preserve">2026-06-10</w:t>
+        <w:t xml:space="preserve">2026-07-06</w:t>
       </w:r>
     </w:p>
     <w:p>
@@ -456,8 +456,52 @@
             <w:pPr>
               <w:pStyle w:val="Compact"/>
             </w:pPr>
-            <w:r>
-              <w:t xml:space="preserve">Open Source &amp; the Code an AI Learned From — Linux, Git &amp; Copilot</w:t>
+            <w:hyperlink r:id="rId16">
+              <w:r>
+                <w:rPr>
+                  <w:rStyle w:val="Hyperlink"/>
+                </w:rPr>
+                <w:t xml:space="preserve">Open Source and the Code an AI Learned From — Linux, Git &amp; Copilot</w:t>
+              </w:r>
+            </w:hyperlink>
+          </w:p>
+        </w:tc>
+        <w:tc>
+          <w:tcPr/>
+          <w:p>
+            <w:pPr>
+              <w:pStyle w:val="Compact"/>
+            </w:pPr>
+            <w:r>
+              <w:rPr>
+                <w:b/>
+                <w:bCs/>
+              </w:rPr>
+              <w:t xml:space="preserve">Available</w:t>
+            </w:r>
+          </w:p>
+        </w:tc>
+      </w:tr>
+      <w:tr>
+        <w:tc>
+          <w:tcPr/>
+          <w:p>
+            <w:pPr>
+              <w:pStyle w:val="Compact"/>
+            </w:pPr>
+            <w:r>
+              <w:t xml:space="preserve">9</w:t>
+            </w:r>
+          </w:p>
+        </w:tc>
+        <w:tc>
+          <w:tcPr/>
+          <w:p>
+            <w:pPr>
+              <w:pStyle w:val="Compact"/>
+            </w:pPr>
+            <w:r>
+              <w:t xml:space="preserve">From SQL to NoSQL — Why Google Built Bigtable</w:t>
             </w:r>
           </w:p>
         </w:tc>
@@ -485,18 +529,18 @@
               <w:pStyle w:val="Compact"/>
             </w:pPr>
             <w:r>
-              <w:t xml:space="preserve">9</w:t>
-            </w:r>
-          </w:p>
-        </w:tc>
-        <w:tc>
-          <w:tcPr/>
-          <w:p>
-            <w:pPr>
-              <w:pStyle w:val="Compact"/>
-            </w:pPr>
-            <w:r>
-              <w:t xml:space="preserve">From SQL to NoSQL — Why Google Built Bigtable</w:t>
+              <w:t xml:space="preserve">10</w:t>
+            </w:r>
+          </w:p>
+        </w:tc>
+        <w:tc>
+          <w:tcPr/>
+          <w:p>
+            <w:pPr>
+              <w:pStyle w:val="Compact"/>
+            </w:pPr>
+            <w:r>
+              <w:t xml:space="preserve">Three Companies Own the Internet — ARPANET to the Cloud Oligopoly</w:t>
             </w:r>
           </w:p>
         </w:tc>
@@ -524,18 +568,18 @@
               <w:pStyle w:val="Compact"/>
             </w:pPr>
             <w:r>
-              <w:t xml:space="preserve">10</w:t>
-            </w:r>
-          </w:p>
-        </w:tc>
-        <w:tc>
-          <w:tcPr/>
-          <w:p>
-            <w:pPr>
-              <w:pStyle w:val="Compact"/>
-            </w:pPr>
-            <w:r>
-              <w:t xml:space="preserve">Three Companies Own the Internet — ARPANET to the Cloud Oligopoly</w:t>
+              <w:t xml:space="preserve">11</w:t>
+            </w:r>
+          </w:p>
+        </w:tc>
+        <w:tc>
+          <w:tcPr/>
+          <w:p>
+            <w:pPr>
+              <w:pStyle w:val="Compact"/>
+            </w:pPr>
+            <w:r>
+              <w:t xml:space="preserve">The Equifax Breach</w:t>
             </w:r>
           </w:p>
         </w:tc>
@@ -563,18 +607,18 @@
               <w:pStyle w:val="Compact"/>
             </w:pPr>
             <w:r>
-              <w:t xml:space="preserve">11</w:t>
-            </w:r>
-          </w:p>
-        </w:tc>
-        <w:tc>
-          <w:tcPr/>
-          <w:p>
-            <w:pPr>
-              <w:pStyle w:val="Compact"/>
-            </w:pPr>
-            <w:r>
-              <w:t xml:space="preserve">The Equifax Breach</w:t>
+              <w:t xml:space="preserve">12</w:t>
+            </w:r>
+          </w:p>
+        </w:tc>
+        <w:tc>
+          <w:tcPr/>
+          <w:p>
+            <w:pPr>
+              <w:pStyle w:val="Compact"/>
+            </w:pPr>
+            <w:r>
+              <w:t xml:space="preserve">COMPAS, Facial Recognition &amp; AI Accountability</w:t>
             </w:r>
           </w:p>
         </w:tc>
@@ -594,47 +638,8 @@
           </w:p>
         </w:tc>
       </w:tr>
-      <w:tr>
-        <w:tc>
-          <w:tcPr/>
-          <w:p>
-            <w:pPr>
-              <w:pStyle w:val="Compact"/>
-            </w:pPr>
-            <w:r>
-              <w:t xml:space="preserve">12</w:t>
-            </w:r>
-          </w:p>
-        </w:tc>
-        <w:tc>
-          <w:tcPr/>
-          <w:p>
-            <w:pPr>
-              <w:pStyle w:val="Compact"/>
-            </w:pPr>
-            <w:r>
-              <w:t xml:space="preserve">COMPAS, Facial Recognition &amp; AI Accountability</w:t>
-            </w:r>
-          </w:p>
-        </w:tc>
-        <w:tc>
-          <w:tcPr/>
-          <w:p>
-            <w:pPr>
-              <w:pStyle w:val="Compact"/>
-            </w:pPr>
-            <w:r>
-              <w:rPr>
-                <w:i/>
-                <w:iCs/>
-              </w:rPr>
-              <w:t xml:space="preserve">In progress</w:t>
-            </w:r>
-          </w:p>
-        </w:tc>
-      </w:tr>
     </w:tbl>
-    <w:bookmarkStart w:id="16" w:name="how-to-read-these"/>
+    <w:bookmarkStart w:id="17" w:name="how-to-read-these"/>
     <w:p>
       <w:pPr>
         <w:pStyle w:val="Heading2"/>
@@ -765,7 +770,7 @@
         <w:t xml:space="preserve">looking up.</w:t>
       </w:r>
     </w:p>
-    <w:bookmarkEnd w:id="16"/>
+    <w:bookmarkEnd w:id="17"/>
     <w:sectPr>
       <w:footnotePr>
         <w:numRestart w:val="eachSect"/>

</xml_diff>

<commit_message>
Add case study on the transition from SQL to NoSQL: "From SQL to NoSQL: Why Google Broke the Database"
- Introduced a comprehensive analysis of the evolution of database systems, focusing on Edgar Codd's relational model and Google's Bigtable.
- Discussed the implications of the NoSQL movement and the trade-offs between consistency and availability.
- Included code examples illustrating the differences between relational and NoSQL data handling.
- Added discussion questions and further reading resources to enhance understanding of the topic.
</commit_message>
<xml_diff>
--- a/docs/v2/cases/index.docx
+++ b/docs/v2/cases/index.docx
@@ -31,7 +31,7 @@
         <w:pStyle w:val="Date"/>
       </w:pPr>
       <w:r>
-        <w:t xml:space="preserve">2026-07-06</w:t>
+        <w:t xml:space="preserve">2026-07-07</w:t>
       </w:r>
     </w:p>
     <w:p>
@@ -500,8 +500,52 @@
             <w:pPr>
               <w:pStyle w:val="Compact"/>
             </w:pPr>
-            <w:r>
-              <w:t xml:space="preserve">From SQL to NoSQL — Why Google Built Bigtable</w:t>
+            <w:hyperlink r:id="rId17">
+              <w:r>
+                <w:rPr>
+                  <w:rStyle w:val="Hyperlink"/>
+                </w:rPr>
+                <w:t xml:space="preserve">From SQL to NoSQL: Why Google Broke the Database</w:t>
+              </w:r>
+            </w:hyperlink>
+          </w:p>
+        </w:tc>
+        <w:tc>
+          <w:tcPr/>
+          <w:p>
+            <w:pPr>
+              <w:pStyle w:val="Compact"/>
+            </w:pPr>
+            <w:r>
+              <w:rPr>
+                <w:b/>
+                <w:bCs/>
+              </w:rPr>
+              <w:t xml:space="preserve">Available</w:t>
+            </w:r>
+          </w:p>
+        </w:tc>
+      </w:tr>
+      <w:tr>
+        <w:tc>
+          <w:tcPr/>
+          <w:p>
+            <w:pPr>
+              <w:pStyle w:val="Compact"/>
+            </w:pPr>
+            <w:r>
+              <w:t xml:space="preserve">10</w:t>
+            </w:r>
+          </w:p>
+        </w:tc>
+        <w:tc>
+          <w:tcPr/>
+          <w:p>
+            <w:pPr>
+              <w:pStyle w:val="Compact"/>
+            </w:pPr>
+            <w:r>
+              <w:t xml:space="preserve">Three Companies Own the Internet — ARPANET to the Cloud Oligopoly</w:t>
             </w:r>
           </w:p>
         </w:tc>
@@ -529,18 +573,18 @@
               <w:pStyle w:val="Compact"/>
             </w:pPr>
             <w:r>
-              <w:t xml:space="preserve">10</w:t>
-            </w:r>
-          </w:p>
-        </w:tc>
-        <w:tc>
-          <w:tcPr/>
-          <w:p>
-            <w:pPr>
-              <w:pStyle w:val="Compact"/>
-            </w:pPr>
-            <w:r>
-              <w:t xml:space="preserve">Three Companies Own the Internet — ARPANET to the Cloud Oligopoly</w:t>
+              <w:t xml:space="preserve">11</w:t>
+            </w:r>
+          </w:p>
+        </w:tc>
+        <w:tc>
+          <w:tcPr/>
+          <w:p>
+            <w:pPr>
+              <w:pStyle w:val="Compact"/>
+            </w:pPr>
+            <w:r>
+              <w:t xml:space="preserve">The Equifax Breach</w:t>
             </w:r>
           </w:p>
         </w:tc>
@@ -568,18 +612,18 @@
               <w:pStyle w:val="Compact"/>
             </w:pPr>
             <w:r>
-              <w:t xml:space="preserve">11</w:t>
-            </w:r>
-          </w:p>
-        </w:tc>
-        <w:tc>
-          <w:tcPr/>
-          <w:p>
-            <w:pPr>
-              <w:pStyle w:val="Compact"/>
-            </w:pPr>
-            <w:r>
-              <w:t xml:space="preserve">The Equifax Breach</w:t>
+              <w:t xml:space="preserve">12</w:t>
+            </w:r>
+          </w:p>
+        </w:tc>
+        <w:tc>
+          <w:tcPr/>
+          <w:p>
+            <w:pPr>
+              <w:pStyle w:val="Compact"/>
+            </w:pPr>
+            <w:r>
+              <w:t xml:space="preserve">COMPAS, Facial Recognition &amp; AI Accountability</w:t>
             </w:r>
           </w:p>
         </w:tc>
@@ -599,47 +643,8 @@
           </w:p>
         </w:tc>
       </w:tr>
-      <w:tr>
-        <w:tc>
-          <w:tcPr/>
-          <w:p>
-            <w:pPr>
-              <w:pStyle w:val="Compact"/>
-            </w:pPr>
-            <w:r>
-              <w:t xml:space="preserve">12</w:t>
-            </w:r>
-          </w:p>
-        </w:tc>
-        <w:tc>
-          <w:tcPr/>
-          <w:p>
-            <w:pPr>
-              <w:pStyle w:val="Compact"/>
-            </w:pPr>
-            <w:r>
-              <w:t xml:space="preserve">COMPAS, Facial Recognition &amp; AI Accountability</w:t>
-            </w:r>
-          </w:p>
-        </w:tc>
-        <w:tc>
-          <w:tcPr/>
-          <w:p>
-            <w:pPr>
-              <w:pStyle w:val="Compact"/>
-            </w:pPr>
-            <w:r>
-              <w:rPr>
-                <w:i/>
-                <w:iCs/>
-              </w:rPr>
-              <w:t xml:space="preserve">In progress</w:t>
-            </w:r>
-          </w:p>
-        </w:tc>
-      </w:tr>
     </w:tbl>
-    <w:bookmarkStart w:id="17" w:name="how-to-read-these"/>
+    <w:bookmarkStart w:id="18" w:name="how-to-read-these"/>
     <w:p>
       <w:pPr>
         <w:pStyle w:val="Heading2"/>
@@ -770,7 +775,7 @@
         <w:t xml:space="preserve">looking up.</w:t>
       </w:r>
     </w:p>
-    <w:bookmarkEnd w:id="17"/>
+    <w:bookmarkEnd w:id="18"/>
     <w:sectPr>
       <w:footnotePr>
         <w:numRestart w:val="eachSect"/>

</xml_diff>

<commit_message>
Add new SVG diagram for database schema and create case study on internet centralization
- Added SVG diagram illustrating the database schema for candies, batches, and orders.
- Introduced a new case study titled "Three Companies Own the Internet," exploring the implications of cloud computing centralization and its impact on internet resilience.
</commit_message>
<xml_diff>
--- a/docs/v2/cases/index.docx
+++ b/docs/v2/cases/index.docx
@@ -544,8 +544,52 @@
             <w:pPr>
               <w:pStyle w:val="Compact"/>
             </w:pPr>
-            <w:r>
-              <w:t xml:space="preserve">Three Companies Own the Internet — ARPANET to the Cloud Oligopoly</w:t>
+            <w:hyperlink r:id="rId18">
+              <w:r>
+                <w:rPr>
+                  <w:rStyle w:val="Hyperlink"/>
+                </w:rPr>
+                <w:t xml:space="preserve">Three Companies Own the Internet — ARPANET to the Cloud Oligopoly</w:t>
+              </w:r>
+            </w:hyperlink>
+          </w:p>
+        </w:tc>
+        <w:tc>
+          <w:tcPr/>
+          <w:p>
+            <w:pPr>
+              <w:pStyle w:val="Compact"/>
+            </w:pPr>
+            <w:r>
+              <w:rPr>
+                <w:b/>
+                <w:bCs/>
+              </w:rPr>
+              <w:t xml:space="preserve">Available</w:t>
+            </w:r>
+          </w:p>
+        </w:tc>
+      </w:tr>
+      <w:tr>
+        <w:tc>
+          <w:tcPr/>
+          <w:p>
+            <w:pPr>
+              <w:pStyle w:val="Compact"/>
+            </w:pPr>
+            <w:r>
+              <w:t xml:space="preserve">11</w:t>
+            </w:r>
+          </w:p>
+        </w:tc>
+        <w:tc>
+          <w:tcPr/>
+          <w:p>
+            <w:pPr>
+              <w:pStyle w:val="Compact"/>
+            </w:pPr>
+            <w:r>
+              <w:t xml:space="preserve">The Equifax Breach</w:t>
             </w:r>
           </w:p>
         </w:tc>
@@ -573,18 +617,18 @@
               <w:pStyle w:val="Compact"/>
             </w:pPr>
             <w:r>
-              <w:t xml:space="preserve">11</w:t>
-            </w:r>
-          </w:p>
-        </w:tc>
-        <w:tc>
-          <w:tcPr/>
-          <w:p>
-            <w:pPr>
-              <w:pStyle w:val="Compact"/>
-            </w:pPr>
-            <w:r>
-              <w:t xml:space="preserve">The Equifax Breach</w:t>
+              <w:t xml:space="preserve">12</w:t>
+            </w:r>
+          </w:p>
+        </w:tc>
+        <w:tc>
+          <w:tcPr/>
+          <w:p>
+            <w:pPr>
+              <w:pStyle w:val="Compact"/>
+            </w:pPr>
+            <w:r>
+              <w:t xml:space="preserve">COMPAS, Facial Recognition &amp; AI Accountability</w:t>
             </w:r>
           </w:p>
         </w:tc>
@@ -604,47 +648,8 @@
           </w:p>
         </w:tc>
       </w:tr>
-      <w:tr>
-        <w:tc>
-          <w:tcPr/>
-          <w:p>
-            <w:pPr>
-              <w:pStyle w:val="Compact"/>
-            </w:pPr>
-            <w:r>
-              <w:t xml:space="preserve">12</w:t>
-            </w:r>
-          </w:p>
-        </w:tc>
-        <w:tc>
-          <w:tcPr/>
-          <w:p>
-            <w:pPr>
-              <w:pStyle w:val="Compact"/>
-            </w:pPr>
-            <w:r>
-              <w:t xml:space="preserve">COMPAS, Facial Recognition &amp; AI Accountability</w:t>
-            </w:r>
-          </w:p>
-        </w:tc>
-        <w:tc>
-          <w:tcPr/>
-          <w:p>
-            <w:pPr>
-              <w:pStyle w:val="Compact"/>
-            </w:pPr>
-            <w:r>
-              <w:rPr>
-                <w:i/>
-                <w:iCs/>
-              </w:rPr>
-              <w:t xml:space="preserve">In progress</w:t>
-            </w:r>
-          </w:p>
-        </w:tc>
-      </w:tr>
     </w:tbl>
-    <w:bookmarkStart w:id="18" w:name="how-to-read-these"/>
+    <w:bookmarkStart w:id="19" w:name="how-to-read-these"/>
     <w:p>
       <w:pPr>
         <w:pStyle w:val="Heading2"/>
@@ -775,7 +780,7 @@
         <w:t xml:space="preserve">looking up.</w:t>
       </w:r>
     </w:p>
-    <w:bookmarkEnd w:id="18"/>
+    <w:bookmarkEnd w:id="19"/>
     <w:sectPr>
       <w:footnotePr>
         <w:numRestart w:val="eachSect"/>

</xml_diff>

<commit_message>
Publish Chapter 11: Cybersecurity notebook and Equifax breach case study
Adds NB11 (CIA triad, SQL injection, XSS/validation, hashing & salting,
HTTPS, secrets management, defense in depth) and CS11 (the Equifax
breach). Wires both into the homepage notebook table and case list and
re-renders the whole site so nav, search index, and cross-links are in
sync.

Co-Authored-By: Claude Fable 5 <noreply@anthropic.com>
</commit_message>
<xml_diff>
--- a/docs/v2/cases/index.docx
+++ b/docs/v2/cases/index.docx
@@ -31,7 +31,7 @@
         <w:pStyle w:val="Date"/>
       </w:pPr>
       <w:r>
-        <w:t xml:space="preserve">2026-07-07</w:t>
+        <w:t xml:space="preserve">2026-07-09</w:t>
       </w:r>
     </w:p>
     <w:p>
@@ -588,8 +588,52 @@
             <w:pPr>
               <w:pStyle w:val="Compact"/>
             </w:pPr>
-            <w:r>
-              <w:t xml:space="preserve">The Equifax Breach</w:t>
+            <w:hyperlink r:id="rId19">
+              <w:r>
+                <w:rPr>
+                  <w:rStyle w:val="Hyperlink"/>
+                </w:rPr>
+                <w:t xml:space="preserve">The Equifax Breach</w:t>
+              </w:r>
+            </w:hyperlink>
+          </w:p>
+        </w:tc>
+        <w:tc>
+          <w:tcPr/>
+          <w:p>
+            <w:pPr>
+              <w:pStyle w:val="Compact"/>
+            </w:pPr>
+            <w:r>
+              <w:rPr>
+                <w:b/>
+                <w:bCs/>
+              </w:rPr>
+              <w:t xml:space="preserve">Available</w:t>
+            </w:r>
+          </w:p>
+        </w:tc>
+      </w:tr>
+      <w:tr>
+        <w:tc>
+          <w:tcPr/>
+          <w:p>
+            <w:pPr>
+              <w:pStyle w:val="Compact"/>
+            </w:pPr>
+            <w:r>
+              <w:t xml:space="preserve">12</w:t>
+            </w:r>
+          </w:p>
+        </w:tc>
+        <w:tc>
+          <w:tcPr/>
+          <w:p>
+            <w:pPr>
+              <w:pStyle w:val="Compact"/>
+            </w:pPr>
+            <w:r>
+              <w:t xml:space="preserve">COMPAS, Facial Recognition &amp; AI Accountability</w:t>
             </w:r>
           </w:p>
         </w:tc>
@@ -609,47 +653,8 @@
           </w:p>
         </w:tc>
       </w:tr>
-      <w:tr>
-        <w:tc>
-          <w:tcPr/>
-          <w:p>
-            <w:pPr>
-              <w:pStyle w:val="Compact"/>
-            </w:pPr>
-            <w:r>
-              <w:t xml:space="preserve">12</w:t>
-            </w:r>
-          </w:p>
-        </w:tc>
-        <w:tc>
-          <w:tcPr/>
-          <w:p>
-            <w:pPr>
-              <w:pStyle w:val="Compact"/>
-            </w:pPr>
-            <w:r>
-              <w:t xml:space="preserve">COMPAS, Facial Recognition &amp; AI Accountability</w:t>
-            </w:r>
-          </w:p>
-        </w:tc>
-        <w:tc>
-          <w:tcPr/>
-          <w:p>
-            <w:pPr>
-              <w:pStyle w:val="Compact"/>
-            </w:pPr>
-            <w:r>
-              <w:rPr>
-                <w:i/>
-                <w:iCs/>
-              </w:rPr>
-              <w:t xml:space="preserve">In progress</w:t>
-            </w:r>
-          </w:p>
-        </w:tc>
-      </w:tr>
     </w:tbl>
-    <w:bookmarkStart w:id="19" w:name="how-to-read-these"/>
+    <w:bookmarkStart w:id="20" w:name="how-to-read-these"/>
     <w:p>
       <w:pPr>
         <w:pStyle w:val="Heading2"/>
@@ -780,7 +785,7 @@
         <w:t xml:space="preserve">looking up.</w:t>
       </w:r>
     </w:p>
-    <w:bookmarkEnd w:id="19"/>
+    <w:bookmarkEnd w:id="20"/>
     <w:sectPr>
       <w:footnotePr>
         <w:numRestart w:val="eachSect"/>

</xml_diff>

<commit_message>
Publish Chapter 12: AI/ML & Ethics notebook and COMPAS fairness case study
Completes the course: adds NB12 (machine learning, the perceptron, LLMs,
algorithmic bias, and the costs/accountability of AI) and CS12 ("The Score
and the Face" — COMPAS, facial recognition, and the impossibility of
satisfying every definition of fairness at once). Wires both into the
homepage, flips the last two "in progress" rows, and re-renders the whole
site. All 12 notebooks and 12 case studies are now live.

Co-Authored-By: Claude Fable 5 <noreply@anthropic.com>
</commit_message>
<xml_diff>
--- a/docs/v2/cases/index.docx
+++ b/docs/v2/cases/index.docx
@@ -31,7 +31,7 @@
         <w:pStyle w:val="Date"/>
       </w:pPr>
       <w:r>
-        <w:t xml:space="preserve">2026-07-09</w:t>
+        <w:t xml:space="preserve">2026-07-11</w:t>
       </w:r>
     </w:p>
     <w:p>
@@ -632,9 +632,14 @@
             <w:pPr>
               <w:pStyle w:val="Compact"/>
             </w:pPr>
-            <w:r>
-              <w:t xml:space="preserve">COMPAS, Facial Recognition &amp; AI Accountability</w:t>
-            </w:r>
+            <w:hyperlink r:id="rId20">
+              <w:r>
+                <w:rPr>
+                  <w:rStyle w:val="Hyperlink"/>
+                </w:rPr>
+                <w:t xml:space="preserve">The Score and the Face: COMPAS, Facial Recognition &amp; AI Accountability</w:t>
+              </w:r>
+            </w:hyperlink>
           </w:p>
         </w:tc>
         <w:tc>
@@ -645,16 +650,16 @@
             </w:pPr>
             <w:r>
               <w:rPr>
-                <w:i/>
-                <w:iCs/>
+                <w:b/>
+                <w:bCs/>
               </w:rPr>
-              <w:t xml:space="preserve">In progress</w:t>
+              <w:t xml:space="preserve">Available</w:t>
             </w:r>
           </w:p>
         </w:tc>
       </w:tr>
     </w:tbl>
-    <w:bookmarkStart w:id="20" w:name="how-to-read-these"/>
+    <w:bookmarkStart w:id="21" w:name="how-to-read-these"/>
     <w:p>
       <w:pPr>
         <w:pStyle w:val="Heading2"/>
@@ -785,7 +790,7 @@
         <w:t xml:space="preserve">looking up.</w:t>
       </w:r>
     </w:p>
-    <w:bookmarkEnd w:id="20"/>
+    <w:bookmarkEnd w:id="21"/>
     <w:sectPr>
       <w:footnotePr>
         <w:numRestart w:val="eachSect"/>

</xml_diff>